<commit_message>
Finalize process log and remove presentation notes
</commit_message>
<xml_diff>
--- a/GISProjectDrewBaker/Documentation/GISProcessLogDrewBaker.docx
+++ b/GISProjectDrewBaker/Documentation/GISProcessLogDrewBaker.docx
@@ -17,7 +17,7 @@
         <w:pageBreakBefore w:val="0"/>
       </w:pPr>
       <w:r>
-        <w:t>ASM54000 course project   Drew Baker</w:t>
+        <w:t>Drew Baker   ASM540</w:t>
       </w:r>
     </w:p>
     <w:p>
@@ -37,68 +37,9 @@
       </w:hyperlink>
     </w:p>
     <w:p>
-      <w:pPr>
-        <w:pStyle w:val="Heading1"/>
-        <w:pageBreakBefore w:val="0"/>
-      </w:pPr>
+      <w:pPr/>
       <w:r>
-        <w:t>Recorded dates</w:t>
-      </w:r>
-    </w:p>
-    <w:p>
-      <w:pPr>
-        <w:pageBreakBefore w:val="0"/>
-      </w:pPr>
-      <w:r>
-        <w:t>Dates are from download manifests and saved geoprocessing history.</w:t>
-      </w:r>
-    </w:p>
-    <w:p>
-      <w:pPr>
-        <w:pageBreakBefore w:val="0"/>
-      </w:pPr>
-      <w:r>
-        <w:t>2026-09-13: Verify the selected-cell satellite archive (download manifest).</w:t>
-      </w:r>
-    </w:p>
-    <w:p>
-      <w:pPr>
-        <w:pageBreakBefore w:val="0"/>
-      </w:pPr>
-      <w:r>
-        <w:t>2026-09-26: Acquire regional satellite data, clip habitat, and create the study boundary and grid (manifest and geoprocessing history).</w:t>
-      </w:r>
-    </w:p>
-    <w:p>
-      <w:pPr>
-        <w:pageBreakBefore w:val="0"/>
-      </w:pPr>
-      <w:r>
-        <w:t>2026-10-04: Join annual DHW summaries and classify heat exposure (geoprocessing history).</w:t>
-      </w:r>
-    </w:p>
-    <w:p>
-      <w:pPr>
-        <w:pageBreakBefore w:val="0"/>
-      </w:pPr>
-      <w:r>
-        <w:t>2026-10-09 to 2026-10-10: Add annual SST summaries, prepare logger observations, and calculate seasonal comparisons (geoprocessing history and working record).</w:t>
-      </w:r>
-    </w:p>
-    <w:p>
-      <w:pPr>
-        <w:pageBreakBefore w:val="0"/>
-      </w:pPr>
-      <w:r>
-        <w:t>2026-10-13: Import forecast summaries and create the annual forecast polygons (geoprocessing history).</w:t>
-      </w:r>
-    </w:p>
-    <w:p>
-      <w:pPr>
-        <w:pageBreakBefore w:val="0"/>
-      </w:pPr>
-      <w:r>
-        <w:t>2026-10-16: Consolidate this process log and package the final GIS results.</w:t>
+        <w:t>Processing dates (2026): Sep 13 satellite verification; Sep 26 regional data, habitat and grid; Oct 4 DHW joins; Oct 9–10 SST/logger comparisons; Oct 13 forecast GIS outputs; Oct 16 documentation and packaging.</w:t>
       </w:r>
     </w:p>
     <w:p>
@@ -6630,7 +6571,6 @@
       </w:r>
     </w:p>
     <w:sectPr>
-      <w:footerReference w:type="default" r:id="rId9"/>
       <w:pgSz w:w="12240" w:h="15840"/>
       <w:pgMar w:top="936" w:right="1037" w:bottom="936" w:left="1037" w:header="720" w:footer="403" w:gutter="0"/>
       <w:cols w:space="720"/>
@@ -6638,24 +6578,6 @@
     </w:sectPr>
   </w:body>
 </w:document>
-</file>
-
-<file path=word/footer1.xml><?xml version="1.0" encoding="utf-8"?>
-<w:ftr xmlns:m="http://schemas.openxmlformats.org/officeDocument/2006/math" xmlns:mc="http://schemas.openxmlformats.org/markup-compatibility/2006" xmlns:mo="http://schemas.microsoft.com/office/mac/office/2008/main" xmlns:mv="urn:schemas-microsoft-com:mac:vml" xmlns:o="urn:schemas-microsoft-com:office:office" xmlns:r="http://schemas.openxmlformats.org/officeDocument/2006/relationships" xmlns:v="urn:schemas-microsoft-com:vml" xmlns:w10="urn:schemas-microsoft-com:office:word" xmlns:w14="http://schemas.microsoft.com/office/word/2010/wordml" xmlns:w="http://schemas.openxmlformats.org/wordprocessingml/2006/main" xmlns:wne="http://schemas.microsoft.com/office/word/2006/wordml" xmlns:wp14="http://schemas.microsoft.com/office/word/2010/wordprocessingDrawing" xmlns:wp="http://schemas.openxmlformats.org/drawingml/2006/wordprocessingDrawing" xmlns:wpc="http://schemas.microsoft.com/office/word/2010/wordprocessingCanvas" xmlns:wpg="http://schemas.microsoft.com/office/word/2010/wordprocessingGroup" xmlns:wpi="http://schemas.microsoft.com/office/word/2010/wordprocessingInk" xmlns:wps="http://schemas.microsoft.com/office/word/2010/wordprocessingShape" mc:Ignorable="w14 wp14">
-  <w:p>
-    <w:pPr>
-      <w:pStyle w:val="Footer"/>
-      <w:jc w:val="right"/>
-    </w:pPr>
-    <w:r>
-      <w:rPr>
-        <w:sz w:val="18"/>
-      </w:rPr>
-      <w:t xml:space="preserve">ASM540 Process Log   |   </w:t>
-    </w:r>
-    <w:fldSimple w:instr="PAGE"/>
-  </w:p>
-</w:ftr>
 </file>
 
 <file path=word/numbering.xml><?xml version="1.0" encoding="utf-8"?>

</xml_diff>

<commit_message>
Link published StoryMap and refresh project materials
</commit_message>
<xml_diff>
--- a/GISProjectDrewBaker/Documentation/GISProcessLogDrewBaker.docx
+++ b/GISProjectDrewBaker/Documentation/GISProcessLogDrewBaker.docx
@@ -32,14 +32,14 @@
           <w:rPr>
             <w:rStyle w:val="Hyperlink"/>
           </w:rPr>
-          <w:t>Following the heat around West Hawaiʻi</w:t>
+          <w:t>In Hot Water</w:t>
         </w:r>
       </w:hyperlink>
     </w:p>
     <w:p>
       <w:pPr/>
       <w:r>
-        <w:t>Processing dates (2026): Sep 13 satellite verification; Sep 26 regional data, habitat and grid; Oct 4 DHW joins; Oct 9–10 SST/logger comparisons; Oct 13 forecast GIS outputs; Oct 16 documentation and packaging.</w:t>
+        <w:t>Processing dates (2026): Sep 13 satellite verification; Sep 26 regional data, habitat and grid; Oct 4 DHW joins; Oct 9–10 SST/logger comparisons; Oct 13 forecast GIS outputs; Oct 16–17 documentation, packaging and StoryMap publication.</w:t>
       </w:r>
     </w:p>
     <w:p>

</xml_diff>